<commit_message>
Booklet: content, components, and CSS updates
Update booklet/programme content and UI: replace/update multiple program note .docx files and add team images. Switch viewport sizing to stable svh for several cover sections. Refactor AnniversaryNav styling and logic (new pill indicator styles and transitionReady state). Enhance Appreciation: introduce NoteSection, foldable “展开全文” inner toggle, and related CSS; refactor entry rendering to preview + more. Programme now supports performersEn and noteEn with corresponding CSS and rendering; durations removed from types and JSON. Update content types in content/booklet.ts and sync content/data/booklet.json (data formatting, English performer fields, minor text fixes). Add a to-do file.
</commit_message>
<xml_diff>
--- a/10_anniversary/program_notes/节目导赏 _ 西厢记-传简.docx
+++ b/10_anniversary/program_notes/节目导赏 _ 西厢记-传简.docx
@@ -462,6 +462,39 @@
         <w:rPr>
           <w:rtl w:val="0"/>
         </w:rPr>
+      </w:r>
+    </w:p>
+    <w:p>
+      <w:pPr>
+        <w:rPr/>
+      </w:pPr>
+      <w:r>
+        <w:rPr>
+          <w:rtl w:val="0"/>
+        </w:rPr>
+        <w:t xml:space="preserve">七、主演介绍</w:t>
+      </w:r>
+    </w:p>
+    <w:p>
+      <w:pPr>
+        <w:rPr/>
+      </w:pPr>
+      <w:r>
+        <w:rPr>
+          <w:rtl w:val="0"/>
+        </w:rPr>
+        <w:t xml:space="preserve">孟伟 饰 张生 孟伟越剧艺术传习所创始人 </w:t>
+      </w:r>
+    </w:p>
+    <w:p>
+      <w:pPr>
+        <w:rPr/>
+      </w:pPr>
+      <w:r>
+        <w:rPr>
+          <w:rtl w:val="0"/>
+        </w:rPr>
+        <w:t xml:space="preserve">史冬梅 饰 红娘 京剧魁北克艺术中心核心成员</w:t>
       </w:r>
     </w:p>
     <w:sectPr>
@@ -838,346 +871,6 @@
       <w:szCs w:val="56"/>
     </w:rPr>
   </w:style>
-  <w:style w:type="paragraph" w:styleId="Heading7">
-    <w:name w:val="heading 7"/>
-    <w:basedOn w:val="Normal"/>
-    <w:next w:val="Normal"/>
-    <w:link w:val="Heading7Char"/>
-    <w:uiPriority w:val="9"/>
-    <w:semiHidden w:val="1"/>
-    <w:unhideWhenUsed w:val="1"/>
-    <w:qFormat w:val="1"/>
-    <w:rsid w:val="00DB3550"/>
-    <w:pPr>
-      <w:keepNext w:val="1"/>
-      <w:keepLines w:val="1"/>
-      <w:spacing w:after="0" w:before="40"/>
-      <w:outlineLvl w:val="6"/>
-    </w:pPr>
-    <w:rPr>
-      <w:rFonts w:cstheme="majorBidi" w:eastAsiaTheme="majorEastAsia"/>
-      <w:color w:val="595959" w:themeColor="text1" w:themeTint="0000A6"/>
-    </w:rPr>
-  </w:style>
-  <w:style w:type="paragraph" w:styleId="Heading8">
-    <w:name w:val="heading 8"/>
-    <w:basedOn w:val="Normal"/>
-    <w:next w:val="Normal"/>
-    <w:link w:val="Heading8Char"/>
-    <w:uiPriority w:val="9"/>
-    <w:semiHidden w:val="1"/>
-    <w:unhideWhenUsed w:val="1"/>
-    <w:qFormat w:val="1"/>
-    <w:rsid w:val="00DB3550"/>
-    <w:pPr>
-      <w:keepNext w:val="1"/>
-      <w:keepLines w:val="1"/>
-      <w:spacing w:after="0"/>
-      <w:outlineLvl w:val="7"/>
-    </w:pPr>
-    <w:rPr>
-      <w:rFonts w:cstheme="majorBidi" w:eastAsiaTheme="majorEastAsia"/>
-      <w:i w:val="1"/>
-      <w:iCs w:val="1"/>
-      <w:color w:val="272727" w:themeColor="text1" w:themeTint="0000D8"/>
-    </w:rPr>
-  </w:style>
-  <w:style w:type="paragraph" w:styleId="Heading9">
-    <w:name w:val="heading 9"/>
-    <w:basedOn w:val="Normal"/>
-    <w:next w:val="Normal"/>
-    <w:link w:val="Heading9Char"/>
-    <w:uiPriority w:val="9"/>
-    <w:semiHidden w:val="1"/>
-    <w:unhideWhenUsed w:val="1"/>
-    <w:qFormat w:val="1"/>
-    <w:rsid w:val="00DB3550"/>
-    <w:pPr>
-      <w:keepNext w:val="1"/>
-      <w:keepLines w:val="1"/>
-      <w:spacing w:after="0"/>
-      <w:outlineLvl w:val="8"/>
-    </w:pPr>
-    <w:rPr>
-      <w:rFonts w:cstheme="majorBidi" w:eastAsiaTheme="majorEastAsia"/>
-      <w:color w:val="272727" w:themeColor="text1" w:themeTint="0000D8"/>
-    </w:rPr>
-  </w:style>
-  <w:style w:type="character" w:styleId="DefaultParagraphFont" w:default="1">
-    <w:name w:val="Default Paragraph Font"/>
-    <w:uiPriority w:val="1"/>
-    <w:unhideWhenUsed w:val="1"/>
-  </w:style>
-  <w:style w:type="table" w:styleId="TableNormal" w:default="1">
-    <w:name w:val="Normal Table"/>
-    <w:uiPriority w:val="99"/>
-    <w:semiHidden w:val="1"/>
-    <w:unhideWhenUsed w:val="1"/>
-    <w:tblPr>
-      <w:tblInd w:w="0.0" w:type="dxa"/>
-      <w:tblCellMar>
-        <w:top w:w="0.0" w:type="dxa"/>
-        <w:left w:w="108.0" w:type="dxa"/>
-        <w:bottom w:w="0.0" w:type="dxa"/>
-        <w:right w:w="108.0" w:type="dxa"/>
-      </w:tblCellMar>
-    </w:tblPr>
-  </w:style>
-  <w:style w:type="numbering" w:styleId="NoList" w:default="1">
-    <w:name w:val="No List"/>
-    <w:uiPriority w:val="99"/>
-    <w:semiHidden w:val="1"/>
-    <w:unhideWhenUsed w:val="1"/>
-  </w:style>
-  <w:style w:type="character" w:styleId="Heading1Char" w:customStyle="1">
-    <w:name w:val="Heading 1 Char"/>
-    <w:basedOn w:val="DefaultParagraphFont"/>
-    <w:link w:val="Heading1"/>
-    <w:uiPriority w:val="9"/>
-    <w:rsid w:val="00DB3550"/>
-    <w:rPr>
-      <w:rFonts w:asciiTheme="majorHAnsi" w:cstheme="majorBidi" w:eastAsiaTheme="majorEastAsia" w:hAnsiTheme="majorHAnsi"/>
-      <w:color w:val="0f4761" w:themeColor="accent1" w:themeShade="0000BF"/>
-      <w:sz w:val="40"/>
-      <w:szCs w:val="40"/>
-    </w:rPr>
-  </w:style>
-  <w:style w:type="character" w:styleId="Heading2Char" w:customStyle="1">
-    <w:name w:val="Heading 2 Char"/>
-    <w:basedOn w:val="DefaultParagraphFont"/>
-    <w:link w:val="Heading2"/>
-    <w:uiPriority w:val="9"/>
-    <w:semiHidden w:val="1"/>
-    <w:rsid w:val="00DB3550"/>
-    <w:rPr>
-      <w:rFonts w:asciiTheme="majorHAnsi" w:cstheme="majorBidi" w:eastAsiaTheme="majorEastAsia" w:hAnsiTheme="majorHAnsi"/>
-      <w:color w:val="0f4761" w:themeColor="accent1" w:themeShade="0000BF"/>
-      <w:sz w:val="32"/>
-      <w:szCs w:val="32"/>
-    </w:rPr>
-  </w:style>
-  <w:style w:type="character" w:styleId="Heading3Char" w:customStyle="1">
-    <w:name w:val="Heading 3 Char"/>
-    <w:basedOn w:val="DefaultParagraphFont"/>
-    <w:link w:val="Heading3"/>
-    <w:uiPriority w:val="9"/>
-    <w:semiHidden w:val="1"/>
-    <w:rsid w:val="00DB3550"/>
-    <w:rPr>
-      <w:rFonts w:cstheme="majorBidi" w:eastAsiaTheme="majorEastAsia"/>
-      <w:color w:val="0f4761" w:themeColor="accent1" w:themeShade="0000BF"/>
-      <w:sz w:val="28"/>
-      <w:szCs w:val="28"/>
-    </w:rPr>
-  </w:style>
-  <w:style w:type="character" w:styleId="Heading4Char" w:customStyle="1">
-    <w:name w:val="Heading 4 Char"/>
-    <w:basedOn w:val="DefaultParagraphFont"/>
-    <w:link w:val="Heading4"/>
-    <w:uiPriority w:val="9"/>
-    <w:semiHidden w:val="1"/>
-    <w:rsid w:val="00DB3550"/>
-    <w:rPr>
-      <w:rFonts w:cstheme="majorBidi" w:eastAsiaTheme="majorEastAsia"/>
-      <w:i w:val="1"/>
-      <w:iCs w:val="1"/>
-      <w:color w:val="0f4761" w:themeColor="accent1" w:themeShade="0000BF"/>
-    </w:rPr>
-  </w:style>
-  <w:style w:type="character" w:styleId="Heading5Char" w:customStyle="1">
-    <w:name w:val="Heading 5 Char"/>
-    <w:basedOn w:val="DefaultParagraphFont"/>
-    <w:link w:val="Heading5"/>
-    <w:uiPriority w:val="9"/>
-    <w:semiHidden w:val="1"/>
-    <w:rsid w:val="00DB3550"/>
-    <w:rPr>
-      <w:rFonts w:cstheme="majorBidi" w:eastAsiaTheme="majorEastAsia"/>
-      <w:color w:val="0f4761" w:themeColor="accent1" w:themeShade="0000BF"/>
-    </w:rPr>
-  </w:style>
-  <w:style w:type="character" w:styleId="Heading6Char" w:customStyle="1">
-    <w:name w:val="Heading 6 Char"/>
-    <w:basedOn w:val="DefaultParagraphFont"/>
-    <w:link w:val="Heading6"/>
-    <w:uiPriority w:val="9"/>
-    <w:semiHidden w:val="1"/>
-    <w:rsid w:val="00DB3550"/>
-    <w:rPr>
-      <w:rFonts w:cstheme="majorBidi" w:eastAsiaTheme="majorEastAsia"/>
-      <w:i w:val="1"/>
-      <w:iCs w:val="1"/>
-      <w:color w:val="595959" w:themeColor="text1" w:themeTint="0000A6"/>
-    </w:rPr>
-  </w:style>
-  <w:style w:type="character" w:styleId="Heading7Char" w:customStyle="1">
-    <w:name w:val="Heading 7 Char"/>
-    <w:basedOn w:val="DefaultParagraphFont"/>
-    <w:link w:val="Heading7"/>
-    <w:uiPriority w:val="9"/>
-    <w:semiHidden w:val="1"/>
-    <w:rsid w:val="00DB3550"/>
-    <w:rPr>
-      <w:rFonts w:cstheme="majorBidi" w:eastAsiaTheme="majorEastAsia"/>
-      <w:color w:val="595959" w:themeColor="text1" w:themeTint="0000A6"/>
-    </w:rPr>
-  </w:style>
-  <w:style w:type="character" w:styleId="Heading8Char" w:customStyle="1">
-    <w:name w:val="Heading 8 Char"/>
-    <w:basedOn w:val="DefaultParagraphFont"/>
-    <w:link w:val="Heading8"/>
-    <w:uiPriority w:val="9"/>
-    <w:semiHidden w:val="1"/>
-    <w:rsid w:val="00DB3550"/>
-    <w:rPr>
-      <w:rFonts w:cstheme="majorBidi" w:eastAsiaTheme="majorEastAsia"/>
-      <w:i w:val="1"/>
-      <w:iCs w:val="1"/>
-      <w:color w:val="272727" w:themeColor="text1" w:themeTint="0000D8"/>
-    </w:rPr>
-  </w:style>
-  <w:style w:type="character" w:styleId="Heading9Char" w:customStyle="1">
-    <w:name w:val="Heading 9 Char"/>
-    <w:basedOn w:val="DefaultParagraphFont"/>
-    <w:link w:val="Heading9"/>
-    <w:uiPriority w:val="9"/>
-    <w:semiHidden w:val="1"/>
-    <w:rsid w:val="00DB3550"/>
-    <w:rPr>
-      <w:rFonts w:cstheme="majorBidi" w:eastAsiaTheme="majorEastAsia"/>
-      <w:color w:val="272727" w:themeColor="text1" w:themeTint="0000D8"/>
-    </w:rPr>
-  </w:style>
-  <w:style w:type="character" w:styleId="TitleChar" w:customStyle="1">
-    <w:name w:val="Title Char"/>
-    <w:basedOn w:val="DefaultParagraphFont"/>
-    <w:link w:val="Title"/>
-    <w:uiPriority w:val="10"/>
-    <w:rsid w:val="00DB3550"/>
-    <w:rPr>
-      <w:rFonts w:asciiTheme="majorHAnsi" w:cstheme="majorBidi" w:eastAsiaTheme="majorEastAsia" w:hAnsiTheme="majorHAnsi"/>
-      <w:spacing w:val="-10"/>
-      <w:kern w:val="28"/>
-      <w:sz w:val="56"/>
-      <w:szCs w:val="56"/>
-    </w:rPr>
-  </w:style>
-  <w:style w:type="character" w:styleId="SubtitleChar" w:customStyle="1">
-    <w:name w:val="Subtitle Char"/>
-    <w:basedOn w:val="DefaultParagraphFont"/>
-    <w:link w:val="Subtitle"/>
-    <w:uiPriority w:val="11"/>
-    <w:rsid w:val="00DB3550"/>
-    <w:rPr>
-      <w:rFonts w:cstheme="majorBidi" w:eastAsiaTheme="majorEastAsia"/>
-      <w:color w:val="595959" w:themeColor="text1" w:themeTint="0000A6"/>
-      <w:spacing w:val="15"/>
-      <w:sz w:val="28"/>
-      <w:szCs w:val="28"/>
-    </w:rPr>
-  </w:style>
-  <w:style w:type="paragraph" w:styleId="Quote">
-    <w:name w:val="Quote"/>
-    <w:basedOn w:val="Normal"/>
-    <w:next w:val="Normal"/>
-    <w:link w:val="QuoteChar"/>
-    <w:uiPriority w:val="29"/>
-    <w:qFormat w:val="1"/>
-    <w:rsid w:val="00DB3550"/>
-    <w:pPr>
-      <w:spacing w:before="160"/>
-      <w:jc w:val="center"/>
-    </w:pPr>
-    <w:rPr>
-      <w:i w:val="1"/>
-      <w:iCs w:val="1"/>
-      <w:color w:val="404040" w:themeColor="text1" w:themeTint="0000BF"/>
-    </w:rPr>
-  </w:style>
-  <w:style w:type="character" w:styleId="QuoteChar" w:customStyle="1">
-    <w:name w:val="Quote Char"/>
-    <w:basedOn w:val="DefaultParagraphFont"/>
-    <w:link w:val="Quote"/>
-    <w:uiPriority w:val="29"/>
-    <w:rsid w:val="00DB3550"/>
-    <w:rPr>
-      <w:i w:val="1"/>
-      <w:iCs w:val="1"/>
-      <w:color w:val="404040" w:themeColor="text1" w:themeTint="0000BF"/>
-    </w:rPr>
-  </w:style>
-  <w:style w:type="paragraph" w:styleId="ListParagraph">
-    <w:name w:val="List Paragraph"/>
-    <w:basedOn w:val="Normal"/>
-    <w:uiPriority w:val="34"/>
-    <w:qFormat w:val="1"/>
-    <w:rsid w:val="00DB3550"/>
-    <w:pPr>
-      <w:ind w:left="720"/>
-      <w:contextualSpacing w:val="1"/>
-    </w:pPr>
-  </w:style>
-  <w:style w:type="character" w:styleId="IntenseEmphasis">
-    <w:name w:val="Intense Emphasis"/>
-    <w:basedOn w:val="DefaultParagraphFont"/>
-    <w:uiPriority w:val="21"/>
-    <w:qFormat w:val="1"/>
-    <w:rsid w:val="00DB3550"/>
-    <w:rPr>
-      <w:i w:val="1"/>
-      <w:iCs w:val="1"/>
-      <w:color w:val="0f4761" w:themeColor="accent1" w:themeShade="0000BF"/>
-    </w:rPr>
-  </w:style>
-  <w:style w:type="paragraph" w:styleId="IntenseQuote">
-    <w:name w:val="Intense Quote"/>
-    <w:basedOn w:val="Normal"/>
-    <w:next w:val="Normal"/>
-    <w:link w:val="IntenseQuoteChar"/>
-    <w:uiPriority w:val="30"/>
-    <w:qFormat w:val="1"/>
-    <w:rsid w:val="00DB3550"/>
-    <w:pPr>
-      <w:pBdr>
-        <w:top w:color="0f4761" w:space="10" w:sz="4" w:themeColor="accent1" w:themeShade="0000BF" w:val="single"/>
-        <w:bottom w:color="0f4761" w:space="10" w:sz="4" w:themeColor="accent1" w:themeShade="0000BF" w:val="single"/>
-      </w:pBdr>
-      <w:spacing w:after="360" w:before="360"/>
-      <w:ind w:left="864" w:right="864"/>
-      <w:jc w:val="center"/>
-    </w:pPr>
-    <w:rPr>
-      <w:i w:val="1"/>
-      <w:iCs w:val="1"/>
-      <w:color w:val="0f4761" w:themeColor="accent1" w:themeShade="0000BF"/>
-    </w:rPr>
-  </w:style>
-  <w:style w:type="character" w:styleId="IntenseQuoteChar" w:customStyle="1">
-    <w:name w:val="Intense Quote Char"/>
-    <w:basedOn w:val="DefaultParagraphFont"/>
-    <w:link w:val="IntenseQuote"/>
-    <w:uiPriority w:val="30"/>
-    <w:rsid w:val="00DB3550"/>
-    <w:rPr>
-      <w:i w:val="1"/>
-      <w:iCs w:val="1"/>
-      <w:color w:val="0f4761" w:themeColor="accent1" w:themeShade="0000BF"/>
-    </w:rPr>
-  </w:style>
-  <w:style w:type="character" w:styleId="IntenseReference">
-    <w:name w:val="Intense Reference"/>
-    <w:basedOn w:val="DefaultParagraphFont"/>
-    <w:uiPriority w:val="32"/>
-    <w:qFormat w:val="1"/>
-    <w:rsid w:val="00DB3550"/>
-    <w:rPr>
-      <w:b w:val="1"/>
-      <w:bCs w:val="1"/>
-      <w:smallCaps w:val="1"/>
-      <w:color w:val="0f4761" w:themeColor="accent1" w:themeShade="0000BF"/>
-      <w:spacing w:val="5"/>
-    </w:rPr>
-  </w:style>
   <w:style w:type="paragraph" w:styleId="Subtitle">
     <w:name w:val="Subtitle"/>
     <w:basedOn w:val="Normal"/>
@@ -1203,44 +896,44 @@
         <a:sysClr val="window" lastClr="FFFFFF"/>
       </a:lt1>
       <a:dk2>
-        <a:srgbClr val="0E2841"/>
+        <a:srgbClr val="1F497D"/>
       </a:dk2>
       <a:lt2>
-        <a:srgbClr val="E8E8E8"/>
+        <a:srgbClr val="EEECE1"/>
       </a:lt2>
       <a:accent1>
-        <a:srgbClr val="156082"/>
+        <a:srgbClr val="4F81BD"/>
       </a:accent1>
       <a:accent2>
-        <a:srgbClr val="E97132"/>
+        <a:srgbClr val="C0504D"/>
       </a:accent2>
       <a:accent3>
-        <a:srgbClr val="196B24"/>
+        <a:srgbClr val="9BBB59"/>
       </a:accent3>
       <a:accent4>
-        <a:srgbClr val="0F9ED5"/>
+        <a:srgbClr val="8064A2"/>
       </a:accent4>
       <a:accent5>
-        <a:srgbClr val="A02B93"/>
+        <a:srgbClr val="4BACC6"/>
       </a:accent5>
       <a:accent6>
-        <a:srgbClr val="4EA72E"/>
+        <a:srgbClr val="F79646"/>
       </a:accent6>
       <a:hlink>
-        <a:srgbClr val="467886"/>
+        <a:srgbClr val="0000FF"/>
       </a:hlink>
       <a:folHlink>
-        <a:srgbClr val="96607D"/>
+        <a:srgbClr val="800080"/>
       </a:folHlink>
     </a:clrScheme>
     <a:fontScheme name="Office">
       <a:majorFont>
-        <a:latin typeface="Aptos Display" panose="02110004020202020204"/>
+        <a:latin typeface="Calibri"/>
         <a:ea typeface=""/>
         <a:cs typeface=""/>
-        <a:font script="Jpan" typeface="游ゴシック Light"/>
+        <a:font script="Jpan" typeface="ＭＳ ゴシック"/>
         <a:font script="Hang" typeface="맑은 고딕"/>
-        <a:font script="Hans" typeface="等线 Light"/>
+        <a:font script="Hans" typeface="宋体"/>
         <a:font script="Hant" typeface="新細明體"/>
         <a:font script="Arab" typeface="Times New Roman"/>
         <a:font script="Hebr" typeface="Times New Roman"/>
@@ -1268,31 +961,14 @@
         <a:font script="Viet" typeface="Times New Roman"/>
         <a:font script="Uigh" typeface="Microsoft Uighur"/>
         <a:font script="Geor" typeface="Sylfaen"/>
-        <a:font script="Armn" typeface="Arial"/>
-        <a:font script="Bugi" typeface="Leelawadee UI"/>
-        <a:font script="Bopo" typeface="Microsoft JhengHei"/>
-        <a:font script="Java" typeface="Javanese Text"/>
-        <a:font script="Lisu" typeface="Segoe UI"/>
-        <a:font script="Mymr" typeface="Myanmar Text"/>
-        <a:font script="Nkoo" typeface="Ebrima"/>
-        <a:font script="Olck" typeface="Nirmala UI"/>
-        <a:font script="Osma" typeface="Ebrima"/>
-        <a:font script="Phag" typeface="Phagspa"/>
-        <a:font script="Syrn" typeface="Estrangelo Edessa"/>
-        <a:font script="Syrj" typeface="Estrangelo Edessa"/>
-        <a:font script="Syre" typeface="Estrangelo Edessa"/>
-        <a:font script="Sora" typeface="Nirmala UI"/>
-        <a:font script="Tale" typeface="Microsoft Tai Le"/>
-        <a:font script="Talu" typeface="Microsoft New Tai Lue"/>
-        <a:font script="Tfng" typeface="Ebrima"/>
       </a:majorFont>
       <a:minorFont>
-        <a:latin typeface="Aptos" panose="02110004020202020204"/>
+        <a:latin typeface="Cambria"/>
         <a:ea typeface=""/>
         <a:cs typeface=""/>
-        <a:font script="Jpan" typeface="游明朝"/>
+        <a:font script="Jpan" typeface="ＭＳ 明朝"/>
         <a:font script="Hang" typeface="맑은 고딕"/>
-        <a:font script="Hans" typeface="等线"/>
+        <a:font script="Hans" typeface="宋体"/>
         <a:font script="Hant" typeface="新細明體"/>
         <a:font script="Arab" typeface="Arial"/>
         <a:font script="Hebr" typeface="Arial"/>
@@ -1320,23 +996,6 @@
         <a:font script="Viet" typeface="Arial"/>
         <a:font script="Uigh" typeface="Microsoft Uighur"/>
         <a:font script="Geor" typeface="Sylfaen"/>
-        <a:font script="Armn" typeface="Arial"/>
-        <a:font script="Bugi" typeface="Leelawadee UI"/>
-        <a:font script="Bopo" typeface="Microsoft JhengHei"/>
-        <a:font script="Java" typeface="Javanese Text"/>
-        <a:font script="Lisu" typeface="Segoe UI"/>
-        <a:font script="Mymr" typeface="Myanmar Text"/>
-        <a:font script="Nkoo" typeface="Ebrima"/>
-        <a:font script="Olck" typeface="Nirmala UI"/>
-        <a:font script="Osma" typeface="Ebrima"/>
-        <a:font script="Phag" typeface="Phagspa"/>
-        <a:font script="Syrn" typeface="Estrangelo Edessa"/>
-        <a:font script="Syrj" typeface="Estrangelo Edessa"/>
-        <a:font script="Syre" typeface="Estrangelo Edessa"/>
-        <a:font script="Sora" typeface="Nirmala UI"/>
-        <a:font script="Tale" typeface="Microsoft Tai Le"/>
-        <a:font script="Talu" typeface="Microsoft New Tai Lue"/>
-        <a:font script="Tfng" typeface="Ebrima"/>
       </a:minorFont>
     </a:fontScheme>
     <a:fmtScheme name="Office">
@@ -1348,148 +1007,207 @@
           <a:gsLst>
             <a:gs pos="0">
               <a:schemeClr val="phClr">
-                <a:lumMod val="110000"/>
-                <a:satMod val="105000"/>
-                <a:tint val="67000"/>
+                <a:tint val="50000"/>
+                <a:satMod val="300000"/>
               </a:schemeClr>
             </a:gs>
-            <a:gs pos="50000">
+            <a:gs pos="35000">
               <a:schemeClr val="phClr">
-                <a:lumMod val="105000"/>
-                <a:satMod val="103000"/>
-                <a:tint val="73000"/>
+                <a:tint val="37000"/>
+                <a:satMod val="300000"/>
               </a:schemeClr>
             </a:gs>
             <a:gs pos="100000">
               <a:schemeClr val="phClr">
-                <a:lumMod val="105000"/>
-                <a:satMod val="109000"/>
-                <a:tint val="81000"/>
+                <a:tint val="15000"/>
+                <a:satMod val="350000"/>
               </a:schemeClr>
             </a:gs>
           </a:gsLst>
-          <a:lin ang="5400000" scaled="0"/>
+          <a:lin ang="16200000" scaled="1"/>
         </a:gradFill>
         <a:gradFill rotWithShape="1">
           <a:gsLst>
             <a:gs pos="0">
               <a:schemeClr val="phClr">
-                <a:satMod val="103000"/>
-                <a:lumMod val="102000"/>
-                <a:tint val="94000"/>
-              </a:schemeClr>
-            </a:gs>
-            <a:gs pos="50000">
-              <a:schemeClr val="phClr">
-                <a:satMod val="110000"/>
-                <a:lumMod val="100000"/>
+                <a:tint val="100000"/>
                 <a:shade val="100000"/>
+                <a:satMod val="130000"/>
               </a:schemeClr>
             </a:gs>
             <a:gs pos="100000">
               <a:schemeClr val="phClr">
-                <a:lumMod val="99000"/>
-                <a:satMod val="120000"/>
-                <a:shade val="78000"/>
+                <a:tint val="50000"/>
+                <a:shade val="100000"/>
+                <a:satMod val="350000"/>
               </a:schemeClr>
             </a:gs>
           </a:gsLst>
-          <a:lin ang="5400000" scaled="0"/>
+          <a:lin ang="16200000" scaled="0"/>
         </a:gradFill>
       </a:fillStyleLst>
       <a:lnStyleLst>
-        <a:ln w="6350" cap="flat" cmpd="sng" algn="ctr">
+        <a:ln w="9525" cap="flat" cmpd="sng" algn="ctr">
+          <a:solidFill>
+            <a:schemeClr val="phClr">
+              <a:shade val="95000"/>
+              <a:satMod val="105000"/>
+            </a:schemeClr>
+          </a:solidFill>
+          <a:prstDash val="solid"/>
+        </a:ln>
+        <a:ln w="25400" cap="flat" cmpd="sng" algn="ctr">
           <a:solidFill>
             <a:schemeClr val="phClr"/>
           </a:solidFill>
           <a:prstDash val="solid"/>
-          <a:miter lim="800000"/>
         </a:ln>
-        <a:ln w="12700" cap="flat" cmpd="sng" algn="ctr">
+        <a:ln w="38100" cap="flat" cmpd="sng" algn="ctr">
           <a:solidFill>
             <a:schemeClr val="phClr"/>
           </a:solidFill>
           <a:prstDash val="solid"/>
-          <a:miter lim="800000"/>
-        </a:ln>
-        <a:ln w="19050" cap="flat" cmpd="sng" algn="ctr">
-          <a:solidFill>
-            <a:schemeClr val="phClr"/>
-          </a:solidFill>
-          <a:prstDash val="solid"/>
-          <a:miter lim="800000"/>
         </a:ln>
       </a:lnStyleLst>
       <a:effectStyleLst>
         <a:effectStyle>
-          <a:effectLst/>
-        </a:effectStyle>
-        <a:effectStyle>
-          <a:effectLst/>
+          <a:effectLst>
+            <a:outerShdw blurRad="40000" dist="20000" dir="5400000" rotWithShape="0">
+              <a:srgbClr val="000000">
+                <a:alpha val="38000"/>
+              </a:srgbClr>
+            </a:outerShdw>
+          </a:effectLst>
         </a:effectStyle>
         <a:effectStyle>
           <a:effectLst>
-            <a:outerShdw blurRad="57150" dist="19050" dir="5400000" algn="ctr" rotWithShape="0">
+            <a:outerShdw blurRad="40000" dist="23000" dir="5400000" rotWithShape="0">
               <a:srgbClr val="000000">
-                <a:alpha val="63000"/>
+                <a:alpha val="35000"/>
               </a:srgbClr>
             </a:outerShdw>
           </a:effectLst>
+        </a:effectStyle>
+        <a:effectStyle>
+          <a:effectLst>
+            <a:outerShdw blurRad="40000" dist="23000" dir="5400000" rotWithShape="0">
+              <a:srgbClr val="000000">
+                <a:alpha val="35000"/>
+              </a:srgbClr>
+            </a:outerShdw>
+          </a:effectLst>
+          <a:scene3d>
+            <a:camera prst="orthographicFront">
+              <a:rot lat="0" lon="0" rev="0"/>
+            </a:camera>
+            <a:lightRig rig="threePt" dir="t">
+              <a:rot lat="0" lon="0" rev="1200000"/>
+            </a:lightRig>
+          </a:scene3d>
+          <a:sp3d>
+            <a:bevelT w="63500" h="25400"/>
+          </a:sp3d>
         </a:effectStyle>
       </a:effectStyleLst>
       <a:bgFillStyleLst>
         <a:solidFill>
           <a:schemeClr val="phClr"/>
         </a:solidFill>
-        <a:solidFill>
-          <a:schemeClr val="phClr">
-            <a:tint val="95000"/>
-            <a:satMod val="170000"/>
-          </a:schemeClr>
-        </a:solidFill>
         <a:gradFill rotWithShape="1">
           <a:gsLst>
             <a:gs pos="0">
               <a:schemeClr val="phClr">
-                <a:tint val="93000"/>
-                <a:satMod val="150000"/>
-                <a:shade val="98000"/>
-                <a:lumMod val="102000"/>
+                <a:tint val="40000"/>
+                <a:satMod val="350000"/>
               </a:schemeClr>
             </a:gs>
-            <a:gs pos="50000">
+            <a:gs pos="40000">
               <a:schemeClr val="phClr">
-                <a:tint val="98000"/>
-                <a:satMod val="130000"/>
-                <a:shade val="90000"/>
-                <a:lumMod val="103000"/>
+                <a:tint val="45000"/>
+                <a:shade val="99000"/>
+                <a:satMod val="350000"/>
               </a:schemeClr>
             </a:gs>
             <a:gs pos="100000">
               <a:schemeClr val="phClr">
-                <a:shade val="63000"/>
-                <a:satMod val="120000"/>
+                <a:shade val="20000"/>
+                <a:satMod val="255000"/>
               </a:schemeClr>
             </a:gs>
           </a:gsLst>
-          <a:lin ang="5400000" scaled="0"/>
+          <a:path path="circle">
+            <a:fillToRect l="50000" t="-80000" r="50000" b="180000"/>
+          </a:path>
+        </a:gradFill>
+        <a:gradFill rotWithShape="1">
+          <a:gsLst>
+            <a:gs pos="0">
+              <a:schemeClr val="phClr">
+                <a:tint val="80000"/>
+                <a:satMod val="300000"/>
+              </a:schemeClr>
+            </a:gs>
+            <a:gs pos="100000">
+              <a:schemeClr val="phClr">
+                <a:shade val="30000"/>
+                <a:satMod val="200000"/>
+              </a:schemeClr>
+            </a:gs>
+          </a:gsLst>
+          <a:path path="circle">
+            <a:fillToRect l="50000" t="50000" r="50000" b="50000"/>
+          </a:path>
         </a:gradFill>
       </a:bgFillStyleLst>
     </a:fmtScheme>
   </a:themeElements>
-  <a:objectDefaults/>
+  <a:objectDefaults>
+    <a:spDef>
+      <a:spPr/>
+      <a:bodyPr/>
+      <a:lstStyle/>
+      <a:style>
+        <a:lnRef idx="1">
+          <a:schemeClr val="accent1"/>
+        </a:lnRef>
+        <a:fillRef idx="3">
+          <a:schemeClr val="accent1"/>
+        </a:fillRef>
+        <a:effectRef idx="2">
+          <a:schemeClr val="accent1"/>
+        </a:effectRef>
+        <a:fontRef idx="minor">
+          <a:schemeClr val="lt1"/>
+        </a:fontRef>
+      </a:style>
+    </a:spDef>
+    <a:lnDef>
+      <a:spPr/>
+      <a:bodyPr/>
+      <a:lstStyle/>
+      <a:style>
+        <a:lnRef idx="2">
+          <a:schemeClr val="accent1"/>
+        </a:lnRef>
+        <a:fillRef idx="0">
+          <a:schemeClr val="accent1"/>
+        </a:fillRef>
+        <a:effectRef idx="1">
+          <a:schemeClr val="accent1"/>
+        </a:effectRef>
+        <a:fontRef idx="minor">
+          <a:schemeClr val="tx1"/>
+        </a:fontRef>
+      </a:style>
+    </a:lnDef>
+  </a:objectDefaults>
   <a:extraClrSchemeLst/>
-  <a:extLst>
-    <a:ext uri="{05A4C25C-085E-4340-85A3-A5531E510DB2}">
-      <thm15:themeFamily xmlns:thm15="http://schemas.microsoft.com/office/thememl/2012/main" name="Office Theme" id="{2E142A2C-CD16-42D6-873A-C26D2A0506FA}" vid="{1BDDFF52-6CD6-40A5-AB3C-68EB2F1E4D0A}"/>
-    </a:ext>
-  </a:extLst>
 </a:theme>
 </file>
 
 <file path=customXML/item1.xml><?xml version="1.0" encoding="utf-8"?>
 <go:gDocsCustomXmlDataStorage xmlns:go="http://customooxmlschemas.google.com/" xmlns:r="http://schemas.openxmlformats.org/officeDocument/2006/relationships" uri="GoogleDocsCustomDataVersion2">
-  <go:docsCustomData xmlns:go="http://customooxmlschemas.google.com/" roundtripDataSignature="AMtx7mhOlqyvIqFoagqXLweIh0cwV5t9ZA==">CgMxLjA4AHIhMUNhR1QtWlluN0hURDNrRzdxcl8xV2s1a0ZFT1VxTmtH</go:docsCustomData>
+  <go:docsCustomData xmlns:go="http://customooxmlschemas.google.com/" roundtripDataSignature="AMtx7mi3xUJb/v61nF4uJbU0HVhAMZtDkQ==">CgMxLjA4AHIhMVU0d2g5MzNfNnBCSHlISDNGWFNHd2VMSS1TNzh0WGJw</go:docsCustomData>
 </go:gDocsCustomXmlDataStorage>
 </file>
 

</xml_diff>